<commit_message>
Add forgot-password / reset-password flow (anti-enumeration, reuses password rules)
</commit_message>
<xml_diff>
--- a/LAUNCH_QA_TESTPLAN.docx
+++ b/LAUNCH_QA_TESTPLAN.docx
@@ -1058,6 +1058,469 @@
             </w:pPr>
             <w:r>
               <w:t xml:space="preserve">Each session sees only its own data (setup for 8.x cross-tenant checks)</w:t>
+            </w:r>
+          </w:p>
+        </w:tc>
+        <w:tc>
+          <w:p/>
+        </w:tc>
+        <w:tc>
+          <w:p/>
+        </w:tc>
+      </w:tr>
+      <w:tr>
+        <w:tc>
+          <w:p>
+            <w:pPr>
+              <w:pStyle w:val="Compact"/>
+              <w:jc w:val="left"/>
+            </w:pPr>
+            <w:r>
+              <w:t xml:space="preserve">1.7</w:t>
+            </w:r>
+          </w:p>
+        </w:tc>
+        <w:tc>
+          <w:p>
+            <w:pPr>
+              <w:pStyle w:val="Compact"/>
+              <w:jc w:val="left"/>
+            </w:pPr>
+            <w:r>
+              <w:t xml:space="preserve">Login page shows</w:t>
+            </w:r>
+            <w:r>
+              <w:t xml:space="preserve"> </w:t>
+            </w:r>
+            <w:r>
+              <w:rPr>
+                <w:b/>
+              </w:rPr>
+              <w:t xml:space="preserve">"Forgot password?"</w:t>
+            </w:r>
+            <w:r>
+              <w:t xml:space="preserve"> </w:t>
+            </w:r>
+            <w:r>
+              <w:t xml:space="preserve">link</w:t>
+            </w:r>
+          </w:p>
+        </w:tc>
+        <w:tc>
+          <w:p>
+            <w:pPr>
+              <w:pStyle w:val="Compact"/>
+              <w:jc w:val="left"/>
+            </w:pPr>
+            <w:r>
+              <w:t xml:space="preserve">Present; routes to</w:t>
+            </w:r>
+            <w:r>
+              <w:t xml:space="preserve"> </w:t>
+            </w:r>
+            <w:r>
+              <w:rPr>
+                <w:rStyle w:val="VerbatimChar"/>
+              </w:rPr>
+              <w:t xml:space="preserve">/forgot-password</w:t>
+            </w:r>
+          </w:p>
+        </w:tc>
+        <w:tc>
+          <w:p/>
+        </w:tc>
+        <w:tc>
+          <w:p/>
+        </w:tc>
+      </w:tr>
+      <w:tr>
+        <w:tc>
+          <w:p>
+            <w:pPr>
+              <w:pStyle w:val="Compact"/>
+              <w:jc w:val="left"/>
+            </w:pPr>
+            <w:r>
+              <w:t xml:space="preserve">1.8</w:t>
+            </w:r>
+          </w:p>
+        </w:tc>
+        <w:tc>
+          <w:p>
+            <w:pPr>
+              <w:pStyle w:val="Compact"/>
+              <w:jc w:val="left"/>
+            </w:pPr>
+            <w:r>
+              <w:t xml:space="preserve">Request reset for a</w:t>
+            </w:r>
+            <w:r>
+              <w:t xml:space="preserve"> </w:t>
+            </w:r>
+            <w:r>
+              <w:rPr>
+                <w:b/>
+              </w:rPr>
+              <w:t xml:space="preserve">real</w:t>
+            </w:r>
+            <w:r>
+              <w:t xml:space="preserve"> </w:t>
+            </w:r>
+            <w:r>
+              <w:t xml:space="preserve">account email</w:t>
+            </w:r>
+          </w:p>
+        </w:tc>
+        <w:tc>
+          <w:p>
+            <w:pPr>
+              <w:pStyle w:val="Compact"/>
+              <w:jc w:val="left"/>
+            </w:pPr>
+            <w:r>
+              <w:t xml:space="preserve">Neutral "if an account exists…" confirmation shown; reset email arrives</w:t>
+            </w:r>
+          </w:p>
+        </w:tc>
+        <w:tc>
+          <w:p/>
+        </w:tc>
+        <w:tc>
+          <w:p/>
+        </w:tc>
+      </w:tr>
+      <w:tr>
+        <w:tc>
+          <w:p>
+            <w:pPr>
+              <w:pStyle w:val="Compact"/>
+              <w:jc w:val="left"/>
+            </w:pPr>
+            <w:r>
+              <w:t xml:space="preserve">1.9</w:t>
+            </w:r>
+          </w:p>
+        </w:tc>
+        <w:tc>
+          <w:p>
+            <w:pPr>
+              <w:pStyle w:val="Compact"/>
+              <w:jc w:val="left"/>
+            </w:pPr>
+            <w:r>
+              <w:t xml:space="preserve">[SEC] Request reset for an email with</w:t>
+            </w:r>
+            <w:r>
+              <w:t xml:space="preserve"> </w:t>
+            </w:r>
+            <w:r>
+              <w:rPr>
+                <w:b/>
+              </w:rPr>
+              <w:t xml:space="preserve">no account</w:t>
+            </w:r>
+          </w:p>
+        </w:tc>
+        <w:tc>
+          <w:p>
+            <w:pPr>
+              <w:pStyle w:val="Compact"/>
+              <w:jc w:val="left"/>
+            </w:pPr>
+            <w:r>
+              <w:rPr>
+                <w:b/>
+              </w:rPr>
+              <w:t xml:space="preserve">Same</w:t>
+            </w:r>
+            <w:r>
+              <w:t xml:space="preserve"> </w:t>
+            </w:r>
+            <w:r>
+              <w:t xml:space="preserve">neutral confirmation (no account-enumeration leak); no error revealing existence</w:t>
+            </w:r>
+          </w:p>
+        </w:tc>
+        <w:tc>
+          <w:p/>
+        </w:tc>
+        <w:tc>
+          <w:p/>
+        </w:tc>
+      </w:tr>
+      <w:tr>
+        <w:tc>
+          <w:p>
+            <w:pPr>
+              <w:pStyle w:val="Compact"/>
+              <w:jc w:val="left"/>
+            </w:pPr>
+            <w:r>
+              <w:t xml:space="preserve">1.10</w:t>
+            </w:r>
+          </w:p>
+        </w:tc>
+        <w:tc>
+          <w:p>
+            <w:pPr>
+              <w:pStyle w:val="Compact"/>
+              <w:jc w:val="left"/>
+            </w:pPr>
+            <w:r>
+              <w:t xml:space="preserve">Reset email deliverability</w:t>
+            </w:r>
+          </w:p>
+        </w:tc>
+        <w:tc>
+          <w:p>
+            <w:pPr>
+              <w:pStyle w:val="Compact"/>
+              <w:jc w:val="left"/>
+            </w:pPr>
+            <w:r>
+              <w:t xml:space="preserve">Lands in Gmail</w:t>
+            </w:r>
+            <w:r>
+              <w:t xml:space="preserve"> </w:t>
+            </w:r>
+            <w:r>
+              <w:rPr>
+                <w:b/>
+              </w:rPr>
+              <w:t xml:space="preserve">inbox</w:t>
+            </w:r>
+            <w:r>
+              <w:t xml:space="preserve"> </w:t>
+            </w:r>
+            <w:r>
+              <w:t xml:space="preserve">(not spam); from your domain; SPF/DKIM/DMARC PASS</w:t>
+            </w:r>
+          </w:p>
+        </w:tc>
+        <w:tc>
+          <w:p/>
+        </w:tc>
+        <w:tc>
+          <w:p/>
+        </w:tc>
+      </w:tr>
+      <w:tr>
+        <w:tc>
+          <w:p>
+            <w:pPr>
+              <w:pStyle w:val="Compact"/>
+              <w:jc w:val="left"/>
+            </w:pPr>
+            <w:r>
+              <w:t xml:space="preserve">1.11</w:t>
+            </w:r>
+          </w:p>
+        </w:tc>
+        <w:tc>
+          <w:p>
+            <w:pPr>
+              <w:pStyle w:val="Compact"/>
+              <w:jc w:val="left"/>
+            </w:pPr>
+            <w:r>
+              <w:t xml:space="preserve">Click the reset link →</w:t>
+            </w:r>
+            <w:r>
+              <w:t xml:space="preserve"> </w:t>
+            </w:r>
+            <w:r>
+              <w:rPr>
+                <w:rStyle w:val="VerbatimChar"/>
+              </w:rPr>
+              <w:t xml:space="preserve">/reset-password</w:t>
+            </w:r>
+          </w:p>
+        </w:tc>
+        <w:tc>
+          <w:p>
+            <w:pPr>
+              <w:pStyle w:val="Compact"/>
+              <w:jc w:val="left"/>
+            </w:pPr>
+            <w:r>
+              <w:t xml:space="preserve">Loads; password rules enforced; setting a valid new password succeeds</w:t>
+            </w:r>
+          </w:p>
+        </w:tc>
+        <w:tc>
+          <w:p/>
+        </w:tc>
+        <w:tc>
+          <w:p/>
+        </w:tc>
+      </w:tr>
+      <w:tr>
+        <w:tc>
+          <w:p>
+            <w:pPr>
+              <w:pStyle w:val="Compact"/>
+              <w:jc w:val="left"/>
+            </w:pPr>
+            <w:r>
+              <w:t xml:space="preserve">1.12</w:t>
+            </w:r>
+          </w:p>
+        </w:tc>
+        <w:tc>
+          <w:p>
+            <w:pPr>
+              <w:pStyle w:val="Compact"/>
+              <w:jc w:val="left"/>
+            </w:pPr>
+            <w:r>
+              <w:t xml:space="preserve">Log in with the</w:t>
+            </w:r>
+            <w:r>
+              <w:t xml:space="preserve"> </w:t>
+            </w:r>
+            <w:r>
+              <w:rPr>
+                <w:b/>
+              </w:rPr>
+              <w:t xml:space="preserve">new</w:t>
+            </w:r>
+            <w:r>
+              <w:t xml:space="preserve"> </w:t>
+            </w:r>
+            <w:r>
+              <w:t xml:space="preserve">password</w:t>
+            </w:r>
+          </w:p>
+        </w:tc>
+        <w:tc>
+          <w:p>
+            <w:pPr>
+              <w:pStyle w:val="Compact"/>
+              <w:jc w:val="left"/>
+            </w:pPr>
+            <w:r>
+              <w:t xml:space="preserve">Works;</w:t>
+            </w:r>
+            <w:r>
+              <w:t xml:space="preserve"> </w:t>
+            </w:r>
+            <w:r>
+              <w:rPr>
+                <w:b/>
+              </w:rPr>
+              <w:t xml:space="preserve">old</w:t>
+            </w:r>
+            <w:r>
+              <w:t xml:space="preserve"> </w:t>
+            </w:r>
+            <w:r>
+              <w:t xml:space="preserve">password no longer works</w:t>
+            </w:r>
+          </w:p>
+        </w:tc>
+        <w:tc>
+          <w:p/>
+        </w:tc>
+        <w:tc>
+          <w:p/>
+        </w:tc>
+      </w:tr>
+      <w:tr>
+        <w:tc>
+          <w:p>
+            <w:pPr>
+              <w:pStyle w:val="Compact"/>
+              <w:jc w:val="left"/>
+            </w:pPr>
+            <w:r>
+              <w:t xml:space="preserve">1.13</w:t>
+            </w:r>
+          </w:p>
+        </w:tc>
+        <w:tc>
+          <w:p>
+            <w:pPr>
+              <w:pStyle w:val="Compact"/>
+              <w:jc w:val="left"/>
+            </w:pPr>
+            <w:r>
+              <w:t xml:space="preserve">Reuse an</w:t>
+            </w:r>
+            <w:r>
+              <w:t xml:space="preserve"> </w:t>
+            </w:r>
+            <w:r>
+              <w:rPr>
+                <w:b/>
+              </w:rPr>
+              <w:t xml:space="preserve">already-used</w:t>
+            </w:r>
+            <w:r>
+              <w:t xml:space="preserve"> </w:t>
+            </w:r>
+            <w:r>
+              <w:t xml:space="preserve">or expired reset link</w:t>
+            </w:r>
+          </w:p>
+        </w:tc>
+        <w:tc>
+          <w:p>
+            <w:pPr>
+              <w:pStyle w:val="Compact"/>
+              <w:jc w:val="left"/>
+            </w:pPr>
+            <w:r>
+              <w:t xml:space="preserve">Shows "invalid or expired" with a link to request a new one</w:t>
+            </w:r>
+          </w:p>
+        </w:tc>
+        <w:tc>
+          <w:p/>
+        </w:tc>
+        <w:tc>
+          <w:p/>
+        </w:tc>
+      </w:tr>
+      <w:tr>
+        <w:tc>
+          <w:p>
+            <w:pPr>
+              <w:pStyle w:val="Compact"/>
+              <w:jc w:val="left"/>
+            </w:pPr>
+            <w:r>
+              <w:t xml:space="preserve">1.14</w:t>
+            </w:r>
+          </w:p>
+        </w:tc>
+        <w:tc>
+          <w:p>
+            <w:pPr>
+              <w:pStyle w:val="Compact"/>
+              <w:jc w:val="left"/>
+            </w:pPr>
+            <w:r>
+              <w:t xml:space="preserve">After reset completes</w:t>
+            </w:r>
+          </w:p>
+        </w:tc>
+        <w:tc>
+          <w:p>
+            <w:pPr>
+              <w:pStyle w:val="Compact"/>
+              <w:jc w:val="left"/>
+            </w:pPr>
+            <w:r>
+              <w:t xml:space="preserve">Recovery session is signed out; you land on</w:t>
+            </w:r>
+            <w:r>
+              <w:t xml:space="preserve"> </w:t>
+            </w:r>
+            <w:r>
+              <w:rPr>
+                <w:rStyle w:val="VerbatimChar"/>
+              </w:rPr>
+              <w:t xml:space="preserve">/login</w:t>
             </w:r>
           </w:p>
         </w:tc>

</xml_diff>